<commit_message>
feat: add end-of-exam line detection and non-inline image extraction for docx parsing
</commit_message>
<xml_diff>
--- a/de_kiem_tra_co_dap_an.docx
+++ b/de_kiem_tra_co_dap_an.docx
@@ -42,7 +42,7 @@
           <w:sz w:val="26"/>
           <w:szCs w:val="26"/>
         </w:rPr>
-        <w:t>PHẦN I. CÂU TRẮC NGHIỆM NHIỀU PHƯƠNG ÁN LỰA CHỌN (3,0 ĐIỂM)</w:t>
+        <w:t>CÂU TRẮC NGHIỆM NHIỀU PHƯƠNG ÁN LỰA CHỌN (3,0 ĐIỂM)</w:t>
       </w:r>
       <w:r>
         <w:rPr>
@@ -3199,25 +3199,9 @@
           <w:szCs w:val="26"/>
         </w:rPr>
         <w:drawing>
-          <wp:anchor distT="0" distB="0" distL="114300" distR="114300" simplePos="0" relativeHeight="251655680" behindDoc="1" locked="0" layoutInCell="1" allowOverlap="1" wp14:anchorId="7F2A1314" wp14:editId="2BA3AD77">
-            <wp:simplePos x="0" y="0"/>
-            <wp:positionH relativeFrom="column">
-              <wp:posOffset>2349927</wp:posOffset>
-            </wp:positionH>
-            <wp:positionV relativeFrom="paragraph">
-              <wp:posOffset>33555</wp:posOffset>
-            </wp:positionV>
+          <wp:inline distT="0" distB="0" distL="0" distR="0" wp14:anchorId="7F2A1314" wp14:editId="349A25B8">
             <wp:extent cx="731520" cy="535305"/>
-            <wp:effectExtent l="0" t="0" r="0" b="0"/>
-            <wp:wrapTight wrapText="bothSides">
-              <wp:wrapPolygon edited="0">
-                <wp:start x="0" y="0"/>
-                <wp:lineTo x="0" y="20754"/>
-                <wp:lineTo x="20813" y="20754"/>
-                <wp:lineTo x="20813" y="0"/>
-                <wp:lineTo x="0" y="0"/>
-              </wp:wrapPolygon>
-            </wp:wrapTight>
+            <wp:effectExtent l="0" t="0" r="5080" b="0"/>
             <wp:docPr id="1952743225" name="Picture 1" descr="A yellow triangle with a lightning bolt in it&#10;&#10;Description automatically generated"/>
             <wp:cNvGraphicFramePr>
               <a:graphicFrameLocks xmlns:a="http://schemas.openxmlformats.org/drawingml/2006/main" noChangeAspect="1"/>
@@ -3247,13 +3231,7 @@
                 </pic:pic>
               </a:graphicData>
             </a:graphic>
-            <wp14:sizeRelH relativeFrom="page">
-              <wp14:pctWidth>0</wp14:pctWidth>
-            </wp14:sizeRelH>
-            <wp14:sizeRelV relativeFrom="page">
-              <wp14:pctHeight>0</wp14:pctHeight>
-            </wp14:sizeRelV>
-          </wp:anchor>
+          </wp:inline>
         </w:drawing>
       </w:r>
     </w:p>
@@ -7893,6 +7871,7 @@
           <w:szCs w:val="26"/>
           <w:lang w:val="vi-VN"/>
         </w:rPr>
+        <w:lastRenderedPageBreak/>
         <w:t>__QUESTION__</w:t>
       </w:r>
     </w:p>
@@ -13004,6 +12983,64 @@
           <w:szCs w:val="26"/>
         </w:rPr>
       </w:pPr>
+    </w:p>
+    <w:p>
+      <w:pPr>
+        <w:spacing w:after="0" w:line="360" w:lineRule="auto"/>
+        <w:rPr>
+          <w:rFonts w:ascii="Times New Roman" w:hAnsi="Times New Roman"/>
+          <w:b/>
+          <w:color w:val="000000"/>
+          <w:sz w:val="26"/>
+          <w:szCs w:val="26"/>
+          <w:lang w:val="vi-VN"/>
+        </w:rPr>
+      </w:pPr>
+      <w:r>
+        <w:rPr>
+          <w:rFonts w:ascii="Times New Roman" w:hAnsi="Times New Roman"/>
+          <w:b/>
+          <w:color w:val="000000"/>
+          <w:sz w:val="26"/>
+          <w:szCs w:val="26"/>
+          <w:lang w:val="vi-VN"/>
+        </w:rPr>
+        <w:t>__QUESTION__</w:t>
+      </w:r>
+    </w:p>
+    <w:p>
+      <w:pPr>
+        <w:spacing w:after="0" w:line="360" w:lineRule="auto"/>
+        <w:rPr>
+          <w:rFonts w:ascii="Times New Roman" w:eastAsia="Georgia" w:hAnsi="Times New Roman" w:cs="Times New Roman"/>
+          <w:color w:val="000000" w:themeColor="text1"/>
+          <w:sz w:val="26"/>
+          <w:szCs w:val="26"/>
+          <w:lang w:val="vi-VN"/>
+        </w:rPr>
+      </w:pPr>
+      <w:r>
+        <w:rPr>
+          <w:rFonts w:ascii="Times New Roman" w:eastAsia="Georgia" w:hAnsi="Times New Roman" w:cs="Times New Roman"/>
+          <w:color w:val="000000" w:themeColor="text1"/>
+          <w:sz w:val="26"/>
+          <w:szCs w:val="26"/>
+          <w:lang w:val="vi-VN"/>
+        </w:rPr>
+        <w:t>Cho đồ thị độ dịch chuyển - thời gian của một vật như hình. Chọn phát biểu đúng.</w:t>
+      </w:r>
+    </w:p>
+    <w:p>
+      <w:pPr>
+        <w:spacing w:after="0" w:line="360" w:lineRule="auto"/>
+        <w:rPr>
+          <w:rFonts w:ascii="Times New Roman" w:hAnsi="Times New Roman" w:cs="Times New Roman"/>
+          <w:color w:val="000000" w:themeColor="text1"/>
+          <w:sz w:val="26"/>
+          <w:szCs w:val="26"/>
+          <w:lang w:val="vi-VN"/>
+        </w:rPr>
+      </w:pPr>
       <w:r>
         <w:rPr>
           <w:rFonts w:ascii="Times New Roman" w:hAnsi="Times New Roman" w:cs="Times New Roman"/>
@@ -13015,17 +13052,9 @@
           <w:szCs w:val="26"/>
         </w:rPr>
         <w:drawing>
-          <wp:anchor distT="0" distB="0" distL="114300" distR="114300" simplePos="0" relativeHeight="251666944" behindDoc="0" locked="0" layoutInCell="1" allowOverlap="1" wp14:anchorId="4CF499E5" wp14:editId="18878875">
-            <wp:simplePos x="0" y="0"/>
-            <wp:positionH relativeFrom="column">
-              <wp:posOffset>4516120</wp:posOffset>
-            </wp:positionH>
-            <wp:positionV relativeFrom="paragraph">
-              <wp:posOffset>91440</wp:posOffset>
-            </wp:positionV>
+          <wp:inline distT="0" distB="0" distL="0" distR="0" wp14:anchorId="7AEEAB47" wp14:editId="1BEBDEFB">
             <wp:extent cx="1603375" cy="1234440"/>
-            <wp:effectExtent l="0" t="0" r="0" b="3810"/>
-            <wp:wrapSquare wrapText="bothSides"/>
+            <wp:effectExtent l="0" t="0" r="0" b="0"/>
             <wp:docPr id="57" name="image-f92b7de53217118514afbc3523a0bd16f28807e0.jpg" descr="A blue rectangle with a white background  Description automatically generated"/>
             <wp:cNvGraphicFramePr/>
             <a:graphic xmlns:a="http://schemas.openxmlformats.org/drawingml/2006/main">
@@ -13060,7 +13089,7 @@
                 </pic:pic>
               </a:graphicData>
             </a:graphic>
-          </wp:anchor>
+          </wp:inline>
         </w:drawing>
       </w:r>
     </w:p>
@@ -13068,6 +13097,15 @@
       <w:pPr>
         <w:spacing w:after="0" w:line="360" w:lineRule="auto"/>
         <w:rPr>
+          <w:rFonts w:ascii="Times New Roman" w:hAnsi="Times New Roman" w:cs="Times New Roman"/>
+          <w:color w:val="000000" w:themeColor="text1"/>
+          <w:sz w:val="26"/>
+          <w:szCs w:val="26"/>
+          <w:lang w:val="vi-VN"/>
+        </w:rPr>
+      </w:pPr>
+      <w:r>
+        <w:rPr>
           <w:rFonts w:ascii="Times New Roman" w:hAnsi="Times New Roman"/>
           <w:b/>
           <w:color w:val="000000"/>
@@ -13075,40 +13113,17 @@
           <w:szCs w:val="26"/>
           <w:lang w:val="vi-VN"/>
         </w:rPr>
-      </w:pPr>
-      <w:r>
-        <w:rPr>
-          <w:rFonts w:ascii="Times New Roman" w:hAnsi="Times New Roman"/>
-          <w:b/>
-          <w:color w:val="000000"/>
+        <w:t>__S__</w:t>
+      </w:r>
+      <w:r>
+        <w:rPr>
+          <w:rFonts w:ascii="Times New Roman" w:eastAsia="Georgia" w:hAnsi="Times New Roman" w:cs="Times New Roman"/>
+          <w:color w:val="000000" w:themeColor="text1"/>
           <w:sz w:val="26"/>
           <w:szCs w:val="26"/>
           <w:lang w:val="vi-VN"/>
         </w:rPr>
-        <w:t>__QUESTION__</w:t>
-      </w:r>
-    </w:p>
-    <w:p>
-      <w:pPr>
-        <w:rPr>
-          <w:rFonts w:ascii="Times New Roman" w:hAnsi="Times New Roman"/>
-          <w:b/>
-          <w:color w:val="000000"/>
-          <w:sz w:val="26"/>
-          <w:szCs w:val="26"/>
-          <w:lang w:val="vi-VN"/>
-        </w:rPr>
-      </w:pPr>
-      <w:r>
-        <w:rPr>
-          <w:rFonts w:ascii="Times New Roman" w:hAnsi="Times New Roman"/>
-          <w:b/>
-          <w:color w:val="000000"/>
-          <w:sz w:val="26"/>
-          <w:szCs w:val="26"/>
-          <w:lang w:val="vi-VN"/>
-        </w:rPr>
-        <w:br w:type="page"/>
+        <w:t xml:space="preserve"> Vật đang chuyển động thẳng đều theo chiều dương.</w:t>
       </w:r>
     </w:p>
     <w:p>
@@ -13124,14 +13139,24 @@
       </w:pPr>
       <w:r>
         <w:rPr>
+          <w:rFonts w:ascii="Times New Roman" w:hAnsi="Times New Roman"/>
+          <w:b/>
+          <w:color w:val="000000"/>
+          <w:sz w:val="26"/>
+          <w:szCs w:val="26"/>
+          <w:lang w:val="vi-VN"/>
+        </w:rPr>
+        <w:t>__S__</w:t>
+      </w:r>
+      <w:r>
+        <w:rPr>
           <w:rFonts w:ascii="Times New Roman" w:eastAsia="Georgia" w:hAnsi="Times New Roman" w:cs="Times New Roman"/>
           <w:color w:val="000000" w:themeColor="text1"/>
           <w:sz w:val="26"/>
           <w:szCs w:val="26"/>
           <w:lang w:val="vi-VN"/>
         </w:rPr>
-        <w:lastRenderedPageBreak/>
-        <w:t>Cho đồ thị độ dịch chuyển - thời gian của một vật như hình. Chọn phát biểu đúng.</w:t>
+        <w:t xml:space="preserve"> Vật đang chuyển động thẳng đều theo chiều âm.</w:t>
       </w:r>
     </w:p>
     <w:p>
@@ -13149,78 +13174,13 @@
         <w:rPr>
           <w:rFonts w:ascii="Times New Roman" w:hAnsi="Times New Roman"/>
           <w:b/>
-          <w:color w:val="000000"/>
-          <w:sz w:val="26"/>
-          <w:szCs w:val="26"/>
-          <w:lang w:val="vi-VN"/>
-        </w:rPr>
-        <w:t>__S__</w:t>
-      </w:r>
-      <w:r>
-        <w:rPr>
-          <w:rFonts w:ascii="Times New Roman" w:eastAsia="Georgia" w:hAnsi="Times New Roman" w:cs="Times New Roman"/>
-          <w:color w:val="000000" w:themeColor="text1"/>
-          <w:sz w:val="26"/>
-          <w:szCs w:val="26"/>
-          <w:lang w:val="vi-VN"/>
-        </w:rPr>
-        <w:t xml:space="preserve"> Vật đang chuyển động thẳng đều theo chiều dương.</w:t>
-      </w:r>
-    </w:p>
-    <w:p>
-      <w:pPr>
-        <w:spacing w:after="0" w:line="360" w:lineRule="auto"/>
-        <w:rPr>
-          <w:rFonts w:ascii="Times New Roman" w:hAnsi="Times New Roman" w:cs="Times New Roman"/>
-          <w:color w:val="000000" w:themeColor="text1"/>
-          <w:sz w:val="26"/>
-          <w:szCs w:val="26"/>
-          <w:lang w:val="vi-VN"/>
-        </w:rPr>
-      </w:pPr>
-      <w:r>
-        <w:rPr>
-          <w:rFonts w:ascii="Times New Roman" w:hAnsi="Times New Roman"/>
-          <w:b/>
-          <w:color w:val="000000"/>
-          <w:sz w:val="26"/>
-          <w:szCs w:val="26"/>
-          <w:lang w:val="vi-VN"/>
-        </w:rPr>
-        <w:t>__S__</w:t>
-      </w:r>
-      <w:r>
-        <w:rPr>
-          <w:rFonts w:ascii="Times New Roman" w:eastAsia="Georgia" w:hAnsi="Times New Roman" w:cs="Times New Roman"/>
-          <w:color w:val="000000" w:themeColor="text1"/>
-          <w:sz w:val="26"/>
-          <w:szCs w:val="26"/>
-          <w:lang w:val="vi-VN"/>
-        </w:rPr>
-        <w:t xml:space="preserve"> Vật đang chuyển động thẳng đều theo chiều âm.</w:t>
-      </w:r>
-    </w:p>
-    <w:p>
-      <w:pPr>
-        <w:spacing w:after="0" w:line="360" w:lineRule="auto"/>
-        <w:rPr>
-          <w:rFonts w:ascii="Times New Roman" w:hAnsi="Times New Roman" w:cs="Times New Roman"/>
-          <w:color w:val="000000" w:themeColor="text1"/>
-          <w:sz w:val="26"/>
-          <w:szCs w:val="26"/>
-          <w:lang w:val="vi-VN"/>
-        </w:rPr>
-      </w:pPr>
-      <w:r>
-        <w:rPr>
-          <w:rFonts w:ascii="Times New Roman" w:hAnsi="Times New Roman"/>
-          <w:b/>
           <w:color w:val="FF0000"/>
           <w:sz w:val="26"/>
           <w:szCs w:val="26"/>
           <w:u w:val="single"/>
           <w:lang w:val="vi-VN"/>
         </w:rPr>
+        <w:lastRenderedPageBreak/>
         <w:t>__D__</w:t>
       </w:r>
       <w:r>
@@ -19329,7 +19289,6 @@
           <w:u w:val="single"/>
           <w:lang w:val="vi-VN"/>
         </w:rPr>
-        <w:lastRenderedPageBreak/>
         <w:t>__D__</w:t>
       </w:r>
       <w:proofErr w:type="spellStart"/>
@@ -20565,6 +20524,7 @@
           <w:u w:val="single"/>
           <w:lang w:val="vi-VN"/>
         </w:rPr>
+        <w:lastRenderedPageBreak/>
         <w:t>__D__</w:t>
       </w:r>
       <w:proofErr w:type="spellStart"/>
@@ -29899,7 +29859,6 @@
           <w:szCs w:val="26"/>
           <w:lang w:val="vi-VN"/>
         </w:rPr>
-        <w:lastRenderedPageBreak/>
         <w:t>__S__</w:t>
       </w:r>
       <w:r>
@@ -30428,6 +30387,7 @@
           <w:sz w:val="26"/>
           <w:szCs w:val="26"/>
         </w:rPr>
+        <w:lastRenderedPageBreak/>
         <w:t>PHẦN III. TỰ LUẬN (3,0 ĐIỂM)</w:t>
       </w:r>
       <w:r>

</xml_diff>